<commit_message>
El inicio de sesión es la primera pantalla; saludo general para la administradora
Co-Authored-By: Claude Opus 5.5 <noreply@anthropic.com>
Claude-Session: https://claude.ai/code/session_01C2tUsjjsV22mWzVYKpWCiU
</commit_message>
<xml_diff>
--- a/docs/Manual_Tecnico.docx
+++ b/docs/Manual_Tecnico.docx
@@ -614,7 +614,7 @@
                 <w:sz w:val="20"/>
                 <w:szCs w:val="20"/>
               </w:rPr>
-              <w:t xml:space="preserve"> en la página de inicio: el visitante escribe sin cuenta, un asistente automático responde las preguntas frecuentes y la administradora contesta desde su panel.</w:t>
+              <w:t xml:space="preserve"> en el inicio de sesión y la presentación: el visitante escribe sin cuenta, un asistente automático responde las preguntas frecuentes y la administradora contesta desde su panel.</w:t>
             </w:r>
           </w:p>
           <w:p>
@@ -1526,7 +1526,7 @@
                       <w:sz w:val="19"/>
                       <w:szCs w:val="19"/>
                     </w:rPr>
-                    <w:t xml:space="preserve">Permitir que un visitante sin cuenta escriba al salón por un chat en la página de inicio.</w:t>
+                    <w:t xml:space="preserve">Permitir que un visitante sin cuenta escriba al salón por un chat, sin iniciar sesión.</w:t>
                   </w:r>
                 </w:p>
               </w:tc>
@@ -2897,7 +2897,7 @@
                       <w:sz w:val="19"/>
                       <w:szCs w:val="19"/>
                     </w:rPr>
-                    <w:t xml:space="preserve">No tiene cuenta. Solo puede escribir en el chat de la página de inicio; se reconoce por el código guardado en su navegador.</w:t>
+                    <w:t xml:space="preserve">No tiene cuenta. Solo puede escribir en el chat; se reconoce por el código guardado en su navegador.</w:t>
                   </w:r>
                 </w:p>
               </w:tc>
@@ -9195,7 +9195,7 @@
                       <w:sz w:val="19"/>
                       <w:szCs w:val="19"/>
                     </w:rPr>
-                    <w:t xml:space="preserve">Pantallas de la aplicación.</w:t>
+                    <w:t xml:space="preserve">Pantallas. index.html (inicio de sesión) es la primera: la ruta / redirige ahí.</w:t>
                   </w:r>
                 </w:p>
               </w:tc>
@@ -9371,7 +9371,7 @@
                       <w:sz w:val="19"/>
                       <w:szCs w:val="19"/>
                     </w:rPr>
-                    <w:t xml:space="preserve">Lógica de inicio de sesión, registro y página de inicio.</w:t>
+                    <w:t xml:space="preserve">Lógica del inicio de sesión (incluye la tarjeta de precios), del registro y de la presentación.</w:t>
                   </w:r>
                 </w:p>
               </w:tc>
@@ -9531,7 +9531,7 @@
                       <w:sz w:val="19"/>
                       <w:szCs w:val="19"/>
                     </w:rPr>
-                    <w:t xml:space="preserve">Burbuja del chat en la página de inicio.</w:t>
+                    <w:t xml:space="preserve">Burbuja del chat; se dibuja sola en las páginas que incluyen este archivo.</w:t>
                   </w:r>
                 </w:p>
               </w:tc>

</xml_diff>